<commit_message>
Reflejar el asistente, los correos y la accesibilidad en la EA2 y en la ERS
Tras integrar la rama Brahams/entregable, el sistema tiene piezas que la
presentacion y el documento de requerimientos no mencionaban.

Presentacion EA2:
- Lamina nueva "Atender al cliente sin sumar personal": el asistente
  Pelusa, los ocho avisos por correo y la revision de accesibilidad
- Cifras recontadas ejecutando el proyecto: 137 pruebas con 346
  aserciones, 32 rutas propias y 14 servicios de dominio

Documento de requerimientos:
- RF-18, asistente de atencion en el sitio, con el limite de que solo
  consulta los datos del cliente conectado (RN-01, RN-04)
- RF-19, avisos automaticos por correo y buzon de contacto etiquetado
- Trazabilidad y entregas actualizadas con los dos requerimientos

Co-Authored-By: Claude Opus 5 <noreply@anthropic.com>
Claude-Session: https://claude.ai/code/session_01SBNMpgU4DA2arm6qA7genT
</commit_message>
<xml_diff>
--- a/docs/requerimientos/Requerimientos_VetPetConnect.docx
+++ b/docs/requerimientos/Requerimientos_VetPetConnect.docx
@@ -1182,7 +1182,7 @@
                 <w:sz w:val="19"/>
                 <w:szCs w:val="19"/>
               </w:rPr>
-              <w:t xml:space="preserve">Requerimientos funcionales (RF-01 a RF-17)</w:t>
+              <w:t xml:space="preserve">Requerimientos funcionales (RF-01 a RF-19)</w:t>
             </w:r>
           </w:p>
         </w:tc>
@@ -15451,6 +15451,1002 @@
     </w:tbl>
     <w:p>
       <w:pPr>
+        <w:keepNext/>
+        <w:spacing w:after="120" w:before="280"/>
+      </w:pPr>
+      <w:r>
+        <w:rPr>
+          <w:rFonts w:ascii="Cambria" w:cs="Cambria" w:eastAsia="Cambria" w:hAnsi="Cambria"/>
+          <w:b/>
+          <w:bCs/>
+          <w:color w:val="14594F"/>
+          <w:sz w:val="24"/>
+          <w:szCs w:val="24"/>
+        </w:rPr>
+        <w:t xml:space="preserve">RF-18. Asistente de atención en el sitio</w:t>
+      </w:r>
+    </w:p>
+    <w:tbl>
+      <w:tblPr>
+        <w:tblW w:type="dxa" w:w="9638"/>
+        <w:tblBorders>
+          <w:top w:val="single" w:color="C9D6D2" w:sz="4"/>
+          <w:left w:val="single" w:color="C9D6D2" w:sz="4"/>
+          <w:bottom w:val="single" w:color="C9D6D2" w:sz="4"/>
+          <w:right w:val="single" w:color="C9D6D2" w:sz="4"/>
+          <w:insideH w:val="single" w:color="C9D6D2" w:sz="4"/>
+          <w:insideV w:val="single" w:color="C9D6D2" w:sz="4"/>
+        </w:tblBorders>
+      </w:tblPr>
+      <w:tblGrid>
+        <w:gridCol w:w="1900"/>
+        <w:gridCol w:w="2919"/>
+        <w:gridCol w:w="1900"/>
+        <w:gridCol w:w="2919"/>
+      </w:tblGrid>
+      <w:tr>
+        <w:trPr>
+          <w:cantSplit/>
+        </w:trPr>
+        <w:tc>
+          <w:tcPr>
+            <w:tcW w:type="dxa" w:w="1900"/>
+            <w:shd w:fill="E9F1EF" w:color="auto" w:val="clear"/>
+            <w:tcMar>
+              <w:top w:type="dxa" w:w="70"/>
+              <w:left w:type="dxa" w:w="110"/>
+              <w:bottom w:type="dxa" w:w="70"/>
+              <w:right w:type="dxa" w:w="110"/>
+            </w:tcMar>
+            <w:vAlign w:val="center"/>
+          </w:tcPr>
+          <w:p>
+            <w:pPr>
+              <w:spacing w:after="40" w:before="40" w:line="264"/>
+              <w:jc w:val="left"/>
+            </w:pPr>
+            <w:r>
+              <w:rPr>
+                <w:b/>
+                <w:bCs/>
+                <w:i w:val="false"/>
+                <w:iCs w:val="false"/>
+                <w:color w:val="20262B"/>
+                <w:sz w:val="19"/>
+                <w:szCs w:val="19"/>
+              </w:rPr>
+              <w:t xml:space="preserve">Código</w:t>
+            </w:r>
+          </w:p>
+        </w:tc>
+        <w:tc>
+          <w:tcPr>
+            <w:tcW w:type="dxa" w:w="2919"/>
+            <w:tcMar>
+              <w:top w:type="dxa" w:w="70"/>
+              <w:left w:type="dxa" w:w="110"/>
+              <w:bottom w:type="dxa" w:w="70"/>
+              <w:right w:type="dxa" w:w="110"/>
+            </w:tcMar>
+            <w:vAlign w:val="center"/>
+          </w:tcPr>
+          <w:p>
+            <w:pPr>
+              <w:spacing w:after="40" w:before="40" w:line="264"/>
+              <w:jc w:val="left"/>
+            </w:pPr>
+            <w:r>
+              <w:rPr>
+                <w:b/>
+                <w:bCs/>
+                <w:i w:val="false"/>
+                <w:iCs w:val="false"/>
+                <w:color w:val="14594F"/>
+                <w:sz w:val="19"/>
+                <w:szCs w:val="19"/>
+              </w:rPr>
+              <w:t xml:space="preserve">RF-18</w:t>
+            </w:r>
+          </w:p>
+        </w:tc>
+        <w:tc>
+          <w:tcPr>
+            <w:tcW w:type="dxa" w:w="1900"/>
+            <w:shd w:fill="E9F1EF" w:color="auto" w:val="clear"/>
+            <w:tcMar>
+              <w:top w:type="dxa" w:w="70"/>
+              <w:left w:type="dxa" w:w="110"/>
+              <w:bottom w:type="dxa" w:w="70"/>
+              <w:right w:type="dxa" w:w="110"/>
+            </w:tcMar>
+            <w:vAlign w:val="center"/>
+          </w:tcPr>
+          <w:p>
+            <w:pPr>
+              <w:spacing w:after="40" w:before="40" w:line="264"/>
+              <w:jc w:val="left"/>
+            </w:pPr>
+            <w:r>
+              <w:rPr>
+                <w:b/>
+                <w:bCs/>
+                <w:i w:val="false"/>
+                <w:iCs w:val="false"/>
+                <w:color w:val="20262B"/>
+                <w:sz w:val="19"/>
+                <w:szCs w:val="19"/>
+              </w:rPr>
+              <w:t xml:space="preserve">Prioridad</w:t>
+            </w:r>
+          </w:p>
+        </w:tc>
+        <w:tc>
+          <w:tcPr>
+            <w:tcW w:type="dxa" w:w="2919"/>
+            <w:tcMar>
+              <w:top w:type="dxa" w:w="70"/>
+              <w:left w:type="dxa" w:w="110"/>
+              <w:bottom w:type="dxa" w:w="70"/>
+              <w:right w:type="dxa" w:w="110"/>
+            </w:tcMar>
+            <w:vAlign w:val="center"/>
+          </w:tcPr>
+          <w:p>
+            <w:pPr>
+              <w:spacing w:after="40" w:before="40" w:line="264"/>
+              <w:jc w:val="left"/>
+            </w:pPr>
+            <w:r>
+              <w:rPr>
+                <w:b w:val="false"/>
+                <w:bCs w:val="false"/>
+                <w:i w:val="false"/>
+                <w:iCs w:val="false"/>
+                <w:color w:val="20262B"/>
+                <w:sz w:val="19"/>
+                <w:szCs w:val="19"/>
+              </w:rPr>
+              <w:t xml:space="preserve">Debería tener</w:t>
+            </w:r>
+          </w:p>
+        </w:tc>
+      </w:tr>
+      <w:tr>
+        <w:trPr>
+          <w:cantSplit/>
+        </w:trPr>
+        <w:tc>
+          <w:tcPr>
+            <w:tcW w:type="dxa" w:w="1900"/>
+            <w:shd w:fill="E9F1EF" w:color="auto" w:val="clear"/>
+            <w:tcMar>
+              <w:top w:type="dxa" w:w="70"/>
+              <w:left w:type="dxa" w:w="110"/>
+              <w:bottom w:type="dxa" w:w="70"/>
+              <w:right w:type="dxa" w:w="110"/>
+            </w:tcMar>
+            <w:vAlign w:val="center"/>
+          </w:tcPr>
+          <w:p>
+            <w:pPr>
+              <w:spacing w:after="40" w:before="40" w:line="264"/>
+              <w:jc w:val="left"/>
+            </w:pPr>
+            <w:r>
+              <w:rPr>
+                <w:b/>
+                <w:bCs/>
+                <w:i w:val="false"/>
+                <w:iCs w:val="false"/>
+                <w:color w:val="20262B"/>
+                <w:sz w:val="19"/>
+                <w:szCs w:val="19"/>
+              </w:rPr>
+              <w:t xml:space="preserve">Requerimiento</w:t>
+            </w:r>
+          </w:p>
+        </w:tc>
+        <w:tc>
+          <w:tcPr>
+            <w:tcW w:type="dxa" w:w="7738"/>
+            <w:gridSpan w:val="3"/>
+            <w:tcMar>
+              <w:top w:type="dxa" w:w="70"/>
+              <w:left w:type="dxa" w:w="110"/>
+              <w:bottom w:type="dxa" w:w="70"/>
+              <w:right w:type="dxa" w:w="110"/>
+            </w:tcMar>
+            <w:vAlign w:val="center"/>
+          </w:tcPr>
+          <w:p>
+            <w:pPr>
+              <w:spacing w:after="40" w:before="40" w:line="264"/>
+              <w:jc w:val="left"/>
+            </w:pPr>
+            <w:r>
+              <w:rPr>
+                <w:b w:val="false"/>
+                <w:bCs w:val="false"/>
+                <w:i w:val="false"/>
+                <w:iCs w:val="false"/>
+                <w:color w:val="20262B"/>
+                <w:sz w:val="19"/>
+                <w:szCs w:val="19"/>
+              </w:rPr>
+              <w:t xml:space="preserve">Asistente de atención en el sitio</w:t>
+            </w:r>
+          </w:p>
+        </w:tc>
+      </w:tr>
+      <w:tr>
+        <w:trPr>
+          <w:cantSplit/>
+        </w:trPr>
+        <w:tc>
+          <w:tcPr>
+            <w:tcW w:type="dxa" w:w="1900"/>
+            <w:shd w:fill="E9F1EF" w:color="auto" w:val="clear"/>
+            <w:tcMar>
+              <w:top w:type="dxa" w:w="70"/>
+              <w:left w:type="dxa" w:w="110"/>
+              <w:bottom w:type="dxa" w:w="70"/>
+              <w:right w:type="dxa" w:w="110"/>
+            </w:tcMar>
+            <w:vAlign w:val="center"/>
+          </w:tcPr>
+          <w:p>
+            <w:pPr>
+              <w:spacing w:after="40" w:before="40" w:line="264"/>
+              <w:jc w:val="left"/>
+            </w:pPr>
+            <w:r>
+              <w:rPr>
+                <w:b/>
+                <w:bCs/>
+                <w:i w:val="false"/>
+                <w:iCs w:val="false"/>
+                <w:color w:val="20262B"/>
+                <w:sz w:val="19"/>
+                <w:szCs w:val="19"/>
+              </w:rPr>
+              <w:t xml:space="preserve">Solicitado por</w:t>
+            </w:r>
+          </w:p>
+        </w:tc>
+        <w:tc>
+          <w:tcPr>
+            <w:tcW w:type="dxa" w:w="7738"/>
+            <w:gridSpan w:val="3"/>
+            <w:tcMar>
+              <w:top w:type="dxa" w:w="70"/>
+              <w:left w:type="dxa" w:w="110"/>
+              <w:bottom w:type="dxa" w:w="70"/>
+              <w:right w:type="dxa" w:w="110"/>
+            </w:tcMar>
+            <w:vAlign w:val="center"/>
+          </w:tcPr>
+          <w:p>
+            <w:pPr>
+              <w:spacing w:after="40" w:before="40" w:line="264"/>
+              <w:jc w:val="left"/>
+            </w:pPr>
+            <w:r>
+              <w:rPr>
+                <w:b w:val="false"/>
+                <w:bCs w:val="false"/>
+                <w:i w:val="false"/>
+                <w:iCs w:val="false"/>
+                <w:color w:val="20262B"/>
+                <w:sz w:val="19"/>
+                <w:szCs w:val="19"/>
+              </w:rPr>
+              <w:t xml:space="preserve">Atención al cliente</w:t>
+            </w:r>
+          </w:p>
+        </w:tc>
+      </w:tr>
+      <w:tr>
+        <w:trPr>
+          <w:cantSplit/>
+        </w:trPr>
+        <w:tc>
+          <w:tcPr>
+            <w:tcW w:type="dxa" w:w="1900"/>
+            <w:shd w:fill="E9F1EF" w:color="auto" w:val="clear"/>
+            <w:tcMar>
+              <w:top w:type="dxa" w:w="70"/>
+              <w:left w:type="dxa" w:w="110"/>
+              <w:bottom w:type="dxa" w:w="70"/>
+              <w:right w:type="dxa" w:w="110"/>
+            </w:tcMar>
+            <w:vAlign w:val="center"/>
+          </w:tcPr>
+          <w:p>
+            <w:pPr>
+              <w:spacing w:after="40" w:before="40" w:line="264"/>
+              <w:jc w:val="left"/>
+            </w:pPr>
+            <w:r>
+              <w:rPr>
+                <w:b/>
+                <w:bCs/>
+                <w:i w:val="false"/>
+                <w:iCs w:val="false"/>
+                <w:color w:val="20262B"/>
+                <w:sz w:val="19"/>
+                <w:szCs w:val="19"/>
+              </w:rPr>
+              <w:t xml:space="preserve">Lo que pide la empresa</w:t>
+            </w:r>
+          </w:p>
+        </w:tc>
+        <w:tc>
+          <w:tcPr>
+            <w:tcW w:type="dxa" w:w="7738"/>
+            <w:gridSpan w:val="3"/>
+            <w:tcMar>
+              <w:top w:type="dxa" w:w="70"/>
+              <w:left w:type="dxa" w:w="110"/>
+              <w:bottom w:type="dxa" w:w="70"/>
+              <w:right w:type="dxa" w:w="110"/>
+            </w:tcMar>
+            <w:vAlign w:val="center"/>
+          </w:tcPr>
+          <w:p>
+            <w:pPr>
+              <w:spacing w:after="40" w:before="40" w:line="264"/>
+              <w:jc w:val="left"/>
+            </w:pPr>
+            <w:r>
+              <w:rPr>
+                <w:b w:val="false"/>
+                <w:bCs w:val="false"/>
+                <w:i w:val="false"/>
+                <w:iCs w:val="false"/>
+                <w:color w:val="20262B"/>
+                <w:sz w:val="19"/>
+                <w:szCs w:val="19"/>
+              </w:rPr>
+              <w:t xml:space="preserve">La empresa recibe todos los días las mismas preguntas: cómo comprar, cuánto demora el envío, cuándo toca la vacuna, en qué va mi pedido. Se pide un asistente dentro del sitio que responda esas preguntas solo, a cualquier hora, y que cuando la pregunta sea sobre la cuenta del cliente conteste con sus propios datos. Debe poder usarse eligiendo temas de un menú, sin necesidad de escribir. VetPet Surco no quiere pagar un servicio externo por consulta ni que el asistente invente respuestas que la empresa no ha autorizado.</w:t>
+            </w:r>
+          </w:p>
+        </w:tc>
+      </w:tr>
+      <w:tr>
+        <w:trPr>
+          <w:cantSplit/>
+        </w:trPr>
+        <w:tc>
+          <w:tcPr>
+            <w:tcW w:type="dxa" w:w="1900"/>
+            <w:shd w:fill="E9F1EF" w:color="auto" w:val="clear"/>
+            <w:tcMar>
+              <w:top w:type="dxa" w:w="70"/>
+              <w:left w:type="dxa" w:w="110"/>
+              <w:bottom w:type="dxa" w:w="70"/>
+              <w:right w:type="dxa" w:w="110"/>
+            </w:tcMar>
+            <w:vAlign w:val="center"/>
+          </w:tcPr>
+          <w:p>
+            <w:pPr>
+              <w:spacing w:after="40" w:before="40" w:line="264"/>
+              <w:jc w:val="left"/>
+            </w:pPr>
+            <w:r>
+              <w:rPr>
+                <w:b/>
+                <w:bCs/>
+                <w:i w:val="false"/>
+                <w:iCs w:val="false"/>
+                <w:color w:val="20262B"/>
+                <w:sz w:val="19"/>
+                <w:szCs w:val="19"/>
+              </w:rPr>
+              <w:t xml:space="preserve">Criterio de aceptación</w:t>
+            </w:r>
+          </w:p>
+        </w:tc>
+        <w:tc>
+          <w:tcPr>
+            <w:tcW w:type="dxa" w:w="7738"/>
+            <w:gridSpan w:val="3"/>
+            <w:tcMar>
+              <w:top w:type="dxa" w:w="70"/>
+              <w:left w:type="dxa" w:w="110"/>
+              <w:bottom w:type="dxa" w:w="70"/>
+              <w:right w:type="dxa" w:w="110"/>
+            </w:tcMar>
+            <w:vAlign w:val="center"/>
+          </w:tcPr>
+          <w:p>
+            <w:pPr>
+              <w:spacing w:after="40" w:before="40" w:line="264"/>
+              <w:jc w:val="left"/>
+            </w:pPr>
+            <w:r>
+              <w:rPr>
+                <w:b w:val="false"/>
+                <w:bCs w:val="false"/>
+                <w:i w:val="false"/>
+                <w:iCs w:val="false"/>
+                <w:color w:val="20262B"/>
+                <w:sz w:val="19"/>
+                <w:szCs w:val="19"/>
+              </w:rPr>
+              <w:t xml:space="preserve">El asistente responde las preguntas frecuentes y consulta los pedidos, citas, mascotas y suscripciones del cliente conectado. Nunca muestra datos de otro cliente. Cuando no entiende la pregunta lo dice y ofrece el menú de temas.</w:t>
+            </w:r>
+          </w:p>
+        </w:tc>
+      </w:tr>
+      <w:tr>
+        <w:trPr>
+          <w:cantSplit/>
+        </w:trPr>
+        <w:tc>
+          <w:tcPr>
+            <w:tcW w:type="dxa" w:w="1900"/>
+            <w:shd w:fill="E9F1EF" w:color="auto" w:val="clear"/>
+            <w:tcMar>
+              <w:top w:type="dxa" w:w="70"/>
+              <w:left w:type="dxa" w:w="110"/>
+              <w:bottom w:type="dxa" w:w="70"/>
+              <w:right w:type="dxa" w:w="110"/>
+            </w:tcMar>
+            <w:vAlign w:val="center"/>
+          </w:tcPr>
+          <w:p>
+            <w:pPr>
+              <w:spacing w:after="40" w:before="40" w:line="264"/>
+              <w:jc w:val="left"/>
+            </w:pPr>
+            <w:r>
+              <w:rPr>
+                <w:b/>
+                <w:bCs/>
+                <w:i w:val="false"/>
+                <w:iCs w:val="false"/>
+                <w:color w:val="20262B"/>
+                <w:sz w:val="19"/>
+                <w:szCs w:val="19"/>
+              </w:rPr>
+              <w:t xml:space="preserve">Reglas de negocio</w:t>
+            </w:r>
+          </w:p>
+        </w:tc>
+        <w:tc>
+          <w:tcPr>
+            <w:tcW w:type="dxa" w:w="7738"/>
+            <w:gridSpan w:val="3"/>
+            <w:tcMar>
+              <w:top w:type="dxa" w:w="70"/>
+              <w:left w:type="dxa" w:w="110"/>
+              <w:bottom w:type="dxa" w:w="70"/>
+              <w:right w:type="dxa" w:w="110"/>
+            </w:tcMar>
+            <w:vAlign w:val="center"/>
+          </w:tcPr>
+          <w:p>
+            <w:pPr>
+              <w:spacing w:after="40" w:before="40" w:line="264"/>
+              <w:jc w:val="left"/>
+            </w:pPr>
+            <w:r>
+              <w:rPr>
+                <w:b w:val="false"/>
+                <w:bCs w:val="false"/>
+                <w:i w:val="false"/>
+                <w:iCs w:val="false"/>
+                <w:color w:val="20262B"/>
+                <w:sz w:val="19"/>
+                <w:szCs w:val="19"/>
+              </w:rPr>
+              <w:t xml:space="preserve">RN-01, RN-04</w:t>
+            </w:r>
+          </w:p>
+        </w:tc>
+      </w:tr>
+    </w:tbl>
+    <w:p>
+      <w:pPr>
+        <w:keepNext/>
+        <w:spacing w:after="120" w:before="280"/>
+      </w:pPr>
+      <w:r>
+        <w:rPr>
+          <w:rFonts w:ascii="Cambria" w:cs="Cambria" w:eastAsia="Cambria" w:hAnsi="Cambria"/>
+          <w:b/>
+          <w:bCs/>
+          <w:color w:val="14594F"/>
+          <w:sz w:val="24"/>
+          <w:szCs w:val="24"/>
+        </w:rPr>
+        <w:t xml:space="preserve">RF-19. Avisos automáticos por correo</w:t>
+      </w:r>
+    </w:p>
+    <w:tbl>
+      <w:tblPr>
+        <w:tblW w:type="dxa" w:w="9638"/>
+        <w:tblBorders>
+          <w:top w:val="single" w:color="C9D6D2" w:sz="4"/>
+          <w:left w:val="single" w:color="C9D6D2" w:sz="4"/>
+          <w:bottom w:val="single" w:color="C9D6D2" w:sz="4"/>
+          <w:right w:val="single" w:color="C9D6D2" w:sz="4"/>
+          <w:insideH w:val="single" w:color="C9D6D2" w:sz="4"/>
+          <w:insideV w:val="single" w:color="C9D6D2" w:sz="4"/>
+        </w:tblBorders>
+      </w:tblPr>
+      <w:tblGrid>
+        <w:gridCol w:w="1900"/>
+        <w:gridCol w:w="2919"/>
+        <w:gridCol w:w="1900"/>
+        <w:gridCol w:w="2919"/>
+      </w:tblGrid>
+      <w:tr>
+        <w:trPr>
+          <w:cantSplit/>
+        </w:trPr>
+        <w:tc>
+          <w:tcPr>
+            <w:tcW w:type="dxa" w:w="1900"/>
+            <w:shd w:fill="E9F1EF" w:color="auto" w:val="clear"/>
+            <w:tcMar>
+              <w:top w:type="dxa" w:w="70"/>
+              <w:left w:type="dxa" w:w="110"/>
+              <w:bottom w:type="dxa" w:w="70"/>
+              <w:right w:type="dxa" w:w="110"/>
+            </w:tcMar>
+            <w:vAlign w:val="center"/>
+          </w:tcPr>
+          <w:p>
+            <w:pPr>
+              <w:spacing w:after="40" w:before="40" w:line="264"/>
+              <w:jc w:val="left"/>
+            </w:pPr>
+            <w:r>
+              <w:rPr>
+                <w:b/>
+                <w:bCs/>
+                <w:i w:val="false"/>
+                <w:iCs w:val="false"/>
+                <w:color w:val="20262B"/>
+                <w:sz w:val="19"/>
+                <w:szCs w:val="19"/>
+              </w:rPr>
+              <w:t xml:space="preserve">Código</w:t>
+            </w:r>
+          </w:p>
+        </w:tc>
+        <w:tc>
+          <w:tcPr>
+            <w:tcW w:type="dxa" w:w="2919"/>
+            <w:tcMar>
+              <w:top w:type="dxa" w:w="70"/>
+              <w:left w:type="dxa" w:w="110"/>
+              <w:bottom w:type="dxa" w:w="70"/>
+              <w:right w:type="dxa" w:w="110"/>
+            </w:tcMar>
+            <w:vAlign w:val="center"/>
+          </w:tcPr>
+          <w:p>
+            <w:pPr>
+              <w:spacing w:after="40" w:before="40" w:line="264"/>
+              <w:jc w:val="left"/>
+            </w:pPr>
+            <w:r>
+              <w:rPr>
+                <w:b/>
+                <w:bCs/>
+                <w:i w:val="false"/>
+                <w:iCs w:val="false"/>
+                <w:color w:val="14594F"/>
+                <w:sz w:val="19"/>
+                <w:szCs w:val="19"/>
+              </w:rPr>
+              <w:t xml:space="preserve">RF-19</w:t>
+            </w:r>
+          </w:p>
+        </w:tc>
+        <w:tc>
+          <w:tcPr>
+            <w:tcW w:type="dxa" w:w="1900"/>
+            <w:shd w:fill="E9F1EF" w:color="auto" w:val="clear"/>
+            <w:tcMar>
+              <w:top w:type="dxa" w:w="70"/>
+              <w:left w:type="dxa" w:w="110"/>
+              <w:bottom w:type="dxa" w:w="70"/>
+              <w:right w:type="dxa" w:w="110"/>
+            </w:tcMar>
+            <w:vAlign w:val="center"/>
+          </w:tcPr>
+          <w:p>
+            <w:pPr>
+              <w:spacing w:after="40" w:before="40" w:line="264"/>
+              <w:jc w:val="left"/>
+            </w:pPr>
+            <w:r>
+              <w:rPr>
+                <w:b/>
+                <w:bCs/>
+                <w:i w:val="false"/>
+                <w:iCs w:val="false"/>
+                <w:color w:val="20262B"/>
+                <w:sz w:val="19"/>
+                <w:szCs w:val="19"/>
+              </w:rPr>
+              <w:t xml:space="preserve">Prioridad</w:t>
+            </w:r>
+          </w:p>
+        </w:tc>
+        <w:tc>
+          <w:tcPr>
+            <w:tcW w:type="dxa" w:w="2919"/>
+            <w:tcMar>
+              <w:top w:type="dxa" w:w="70"/>
+              <w:left w:type="dxa" w:w="110"/>
+              <w:bottom w:type="dxa" w:w="70"/>
+              <w:right w:type="dxa" w:w="110"/>
+            </w:tcMar>
+            <w:vAlign w:val="center"/>
+          </w:tcPr>
+          <w:p>
+            <w:pPr>
+              <w:spacing w:after="40" w:before="40" w:line="264"/>
+              <w:jc w:val="left"/>
+            </w:pPr>
+            <w:r>
+              <w:rPr>
+                <w:b w:val="false"/>
+                <w:bCs w:val="false"/>
+                <w:i w:val="false"/>
+                <w:iCs w:val="false"/>
+                <w:color w:val="20262B"/>
+                <w:sz w:val="19"/>
+                <w:szCs w:val="19"/>
+              </w:rPr>
+              <w:t xml:space="preserve">Debe tener</w:t>
+            </w:r>
+          </w:p>
+        </w:tc>
+      </w:tr>
+      <w:tr>
+        <w:trPr>
+          <w:cantSplit/>
+        </w:trPr>
+        <w:tc>
+          <w:tcPr>
+            <w:tcW w:type="dxa" w:w="1900"/>
+            <w:shd w:fill="E9F1EF" w:color="auto" w:val="clear"/>
+            <w:tcMar>
+              <w:top w:type="dxa" w:w="70"/>
+              <w:left w:type="dxa" w:w="110"/>
+              <w:bottom w:type="dxa" w:w="70"/>
+              <w:right w:type="dxa" w:w="110"/>
+            </w:tcMar>
+            <w:vAlign w:val="center"/>
+          </w:tcPr>
+          <w:p>
+            <w:pPr>
+              <w:spacing w:after="40" w:before="40" w:line="264"/>
+              <w:jc w:val="left"/>
+            </w:pPr>
+            <w:r>
+              <w:rPr>
+                <w:b/>
+                <w:bCs/>
+                <w:i w:val="false"/>
+                <w:iCs w:val="false"/>
+                <w:color w:val="20262B"/>
+                <w:sz w:val="19"/>
+                <w:szCs w:val="19"/>
+              </w:rPr>
+              <w:t xml:space="preserve">Requerimiento</w:t>
+            </w:r>
+          </w:p>
+        </w:tc>
+        <w:tc>
+          <w:tcPr>
+            <w:tcW w:type="dxa" w:w="7738"/>
+            <w:gridSpan w:val="3"/>
+            <w:tcMar>
+              <w:top w:type="dxa" w:w="70"/>
+              <w:left w:type="dxa" w:w="110"/>
+              <w:bottom w:type="dxa" w:w="70"/>
+              <w:right w:type="dxa" w:w="110"/>
+            </w:tcMar>
+            <w:vAlign w:val="center"/>
+          </w:tcPr>
+          <w:p>
+            <w:pPr>
+              <w:spacing w:after="40" w:before="40" w:line="264"/>
+              <w:jc w:val="left"/>
+            </w:pPr>
+            <w:r>
+              <w:rPr>
+                <w:b w:val="false"/>
+                <w:bCs w:val="false"/>
+                <w:i w:val="false"/>
+                <w:iCs w:val="false"/>
+                <w:color w:val="20262B"/>
+                <w:sz w:val="19"/>
+                <w:szCs w:val="19"/>
+              </w:rPr>
+              <w:t xml:space="preserve">Avisos automáticos por correo</w:t>
+            </w:r>
+          </w:p>
+        </w:tc>
+      </w:tr>
+      <w:tr>
+        <w:trPr>
+          <w:cantSplit/>
+        </w:trPr>
+        <w:tc>
+          <w:tcPr>
+            <w:tcW w:type="dxa" w:w="1900"/>
+            <w:shd w:fill="E9F1EF" w:color="auto" w:val="clear"/>
+            <w:tcMar>
+              <w:top w:type="dxa" w:w="70"/>
+              <w:left w:type="dxa" w:w="110"/>
+              <w:bottom w:type="dxa" w:w="70"/>
+              <w:right w:type="dxa" w:w="110"/>
+            </w:tcMar>
+            <w:vAlign w:val="center"/>
+          </w:tcPr>
+          <w:p>
+            <w:pPr>
+              <w:spacing w:after="40" w:before="40" w:line="264"/>
+              <w:jc w:val="left"/>
+            </w:pPr>
+            <w:r>
+              <w:rPr>
+                <w:b/>
+                <w:bCs/>
+                <w:i w:val="false"/>
+                <w:iCs w:val="false"/>
+                <w:color w:val="20262B"/>
+                <w:sz w:val="19"/>
+                <w:szCs w:val="19"/>
+              </w:rPr>
+              <w:t xml:space="preserve">Solicitado por</w:t>
+            </w:r>
+          </w:p>
+        </w:tc>
+        <w:tc>
+          <w:tcPr>
+            <w:tcW w:type="dxa" w:w="7738"/>
+            <w:gridSpan w:val="3"/>
+            <w:tcMar>
+              <w:top w:type="dxa" w:w="70"/>
+              <w:left w:type="dxa" w:w="110"/>
+              <w:bottom w:type="dxa" w:w="70"/>
+              <w:right w:type="dxa" w:w="110"/>
+            </w:tcMar>
+            <w:vAlign w:val="center"/>
+          </w:tcPr>
+          <w:p>
+            <w:pPr>
+              <w:spacing w:after="40" w:before="40" w:line="264"/>
+              <w:jc w:val="left"/>
+            </w:pPr>
+            <w:r>
+              <w:rPr>
+                <w:b w:val="false"/>
+                <w:bCs w:val="false"/>
+                <w:i w:val="false"/>
+                <w:iCs w:val="false"/>
+                <w:color w:val="20262B"/>
+                <w:sz w:val="19"/>
+                <w:szCs w:val="19"/>
+              </w:rPr>
+              <w:t xml:space="preserve">Gerencia General, atención al cliente</w:t>
+            </w:r>
+          </w:p>
+        </w:tc>
+      </w:tr>
+      <w:tr>
+        <w:trPr>
+          <w:cantSplit/>
+        </w:trPr>
+        <w:tc>
+          <w:tcPr>
+            <w:tcW w:type="dxa" w:w="1900"/>
+            <w:shd w:fill="E9F1EF" w:color="auto" w:val="clear"/>
+            <w:tcMar>
+              <w:top w:type="dxa" w:w="70"/>
+              <w:left w:type="dxa" w:w="110"/>
+              <w:bottom w:type="dxa" w:w="70"/>
+              <w:right w:type="dxa" w:w="110"/>
+            </w:tcMar>
+            <w:vAlign w:val="center"/>
+          </w:tcPr>
+          <w:p>
+            <w:pPr>
+              <w:spacing w:after="40" w:before="40" w:line="264"/>
+              <w:jc w:val="left"/>
+            </w:pPr>
+            <w:r>
+              <w:rPr>
+                <w:b/>
+                <w:bCs/>
+                <w:i w:val="false"/>
+                <w:iCs w:val="false"/>
+                <w:color w:val="20262B"/>
+                <w:sz w:val="19"/>
+                <w:szCs w:val="19"/>
+              </w:rPr>
+              <w:t xml:space="preserve">Lo que pide la empresa</w:t>
+            </w:r>
+          </w:p>
+        </w:tc>
+        <w:tc>
+          <w:tcPr>
+            <w:tcW w:type="dxa" w:w="7738"/>
+            <w:gridSpan w:val="3"/>
+            <w:tcMar>
+              <w:top w:type="dxa" w:w="70"/>
+              <w:left w:type="dxa" w:w="110"/>
+              <w:bottom w:type="dxa" w:w="70"/>
+              <w:right w:type="dxa" w:w="110"/>
+            </w:tcMar>
+            <w:vAlign w:val="center"/>
+          </w:tcPr>
+          <w:p>
+            <w:pPr>
+              <w:spacing w:after="40" w:before="40" w:line="264"/>
+              <w:jc w:val="left"/>
+            </w:pPr>
+            <w:r>
+              <w:rPr>
+                <w:b w:val="false"/>
+                <w:bCs w:val="false"/>
+                <w:i w:val="false"/>
+                <w:iCs w:val="false"/>
+                <w:color w:val="20262B"/>
+                <w:sz w:val="19"/>
+                <w:szCs w:val="19"/>
+              </w:rPr>
+              <w:t xml:space="preserve">Cada hecho importante debe llegar al correo del cliente sin que nadie lo escriba a mano: la bienvenida al registrarse, la confirmación del pedido y su factura, la cita reservada, el despacho de la suscripción, el cambio de plan y el recordatorio del próximo control. Además, los mensajes que el cliente envía desde la página de contacto deben llegar al buzón de la empresa clasificados por tipo, para que el equipo distinga de un vistazo una consulta veterinaria de un reclamo por un pedido.</w:t>
+            </w:r>
+          </w:p>
+        </w:tc>
+      </w:tr>
+      <w:tr>
+        <w:trPr>
+          <w:cantSplit/>
+        </w:trPr>
+        <w:tc>
+          <w:tcPr>
+            <w:tcW w:type="dxa" w:w="1900"/>
+            <w:shd w:fill="E9F1EF" w:color="auto" w:val="clear"/>
+            <w:tcMar>
+              <w:top w:type="dxa" w:w="70"/>
+              <w:left w:type="dxa" w:w="110"/>
+              <w:bottom w:type="dxa" w:w="70"/>
+              <w:right w:type="dxa" w:w="110"/>
+            </w:tcMar>
+            <w:vAlign w:val="center"/>
+          </w:tcPr>
+          <w:p>
+            <w:pPr>
+              <w:spacing w:after="40" w:before="40" w:line="264"/>
+              <w:jc w:val="left"/>
+            </w:pPr>
+            <w:r>
+              <w:rPr>
+                <w:b/>
+                <w:bCs/>
+                <w:i w:val="false"/>
+                <w:iCs w:val="false"/>
+                <w:color w:val="20262B"/>
+                <w:sz w:val="19"/>
+                <w:szCs w:val="19"/>
+              </w:rPr>
+              <w:t xml:space="preserve">Criterio de aceptación</w:t>
+            </w:r>
+          </w:p>
+        </w:tc>
+        <w:tc>
+          <w:tcPr>
+            <w:tcW w:type="dxa" w:w="7738"/>
+            <w:gridSpan w:val="3"/>
+            <w:tcMar>
+              <w:top w:type="dxa" w:w="70"/>
+              <w:left w:type="dxa" w:w="110"/>
+              <w:bottom w:type="dxa" w:w="70"/>
+              <w:right w:type="dxa" w:w="110"/>
+            </w:tcMar>
+            <w:vAlign w:val="center"/>
+          </w:tcPr>
+          <w:p>
+            <w:pPr>
+              <w:spacing w:after="40" w:before="40" w:line="264"/>
+              <w:jc w:val="left"/>
+            </w:pPr>
+            <w:r>
+              <w:rPr>
+                <w:b w:val="false"/>
+                <w:bCs w:val="false"/>
+                <w:i w:val="false"/>
+                <w:iCs w:val="false"/>
+                <w:color w:val="20262B"/>
+                <w:sz w:val="19"/>
+                <w:szCs w:val="19"/>
+              </w:rPr>
+              <w:t xml:space="preserve">Los siete avisos salen solos al ocurrir el hecho que los motiva, y el recordatorio de control sale cada mañana sin intervención. El buzón de la empresa recibe cada mensaje de contacto con su etiqueta de tipo en el asunto.</w:t>
+            </w:r>
+          </w:p>
+        </w:tc>
+      </w:tr>
+      <w:tr>
+        <w:trPr>
+          <w:cantSplit/>
+        </w:trPr>
+        <w:tc>
+          <w:tcPr>
+            <w:tcW w:type="dxa" w:w="1900"/>
+            <w:shd w:fill="E9F1EF" w:color="auto" w:val="clear"/>
+            <w:tcMar>
+              <w:top w:type="dxa" w:w="70"/>
+              <w:left w:type="dxa" w:w="110"/>
+              <w:bottom w:type="dxa" w:w="70"/>
+              <w:right w:type="dxa" w:w="110"/>
+            </w:tcMar>
+            <w:vAlign w:val="center"/>
+          </w:tcPr>
+          <w:p>
+            <w:pPr>
+              <w:spacing w:after="40" w:before="40" w:line="264"/>
+              <w:jc w:val="left"/>
+            </w:pPr>
+            <w:r>
+              <w:rPr>
+                <w:b/>
+                <w:bCs/>
+                <w:i w:val="false"/>
+                <w:iCs w:val="false"/>
+                <w:color w:val="20262B"/>
+                <w:sz w:val="19"/>
+                <w:szCs w:val="19"/>
+              </w:rPr>
+              <w:t xml:space="preserve">Reglas de negocio</w:t>
+            </w:r>
+          </w:p>
+        </w:tc>
+        <w:tc>
+          <w:tcPr>
+            <w:tcW w:type="dxa" w:w="7738"/>
+            <w:gridSpan w:val="3"/>
+            <w:tcMar>
+              <w:top w:type="dxa" w:w="70"/>
+              <w:left w:type="dxa" w:w="110"/>
+              <w:bottom w:type="dxa" w:w="70"/>
+              <w:right w:type="dxa" w:w="110"/>
+            </w:tcMar>
+            <w:vAlign w:val="center"/>
+          </w:tcPr>
+          <w:p>
+            <w:pPr>
+              <w:spacing w:after="40" w:before="40" w:line="264"/>
+              <w:jc w:val="left"/>
+            </w:pPr>
+            <w:r>
+              <w:rPr>
+                <w:b w:val="false"/>
+                <w:bCs w:val="false"/>
+                <w:i w:val="false"/>
+                <w:iCs w:val="false"/>
+                <w:color w:val="20262B"/>
+                <w:sz w:val="19"/>
+                <w:szCs w:val="19"/>
+              </w:rPr>
+              <w:t xml:space="preserve">RN-20</w:t>
+            </w:r>
+          </w:p>
+        </w:tc>
+      </w:tr>
+    </w:tbl>
+    <w:p>
+      <w:pPr>
         <w:pStyle w:val="Heading1"/>
         <w:keepNext/>
         <w:pageBreakBefore/>
@@ -17375,7 +18371,7 @@
                 <w:sz w:val="19"/>
                 <w:szCs w:val="19"/>
               </w:rPr>
-              <w:t xml:space="preserve">RF-01</w:t>
+              <w:t xml:space="preserve">RF-01, RF-18</w:t>
             </w:r>
           </w:p>
         </w:tc>
@@ -17666,7 +18662,7 @@
                 <w:sz w:val="19"/>
                 <w:szCs w:val="19"/>
               </w:rPr>
-              <w:t xml:space="preserve">RF-10, RF-11</w:t>
+              <w:t xml:space="preserve">RF-10, RF-11, RF-18</w:t>
             </w:r>
           </w:p>
         </w:tc>
@@ -19210,7 +20206,7 @@
                 <w:sz w:val="19"/>
                 <w:szCs w:val="19"/>
               </w:rPr>
-              <w:t xml:space="preserve">RF-14</w:t>
+              <w:t xml:space="preserve">RF-14, RF-19</w:t>
             </w:r>
           </w:p>
         </w:tc>
@@ -20430,7 +21426,7 @@
           <w:sz w:val="21"/>
           <w:szCs w:val="21"/>
         </w:rPr>
-        <w:t xml:space="preserve">Cada uno de los diecisiete requerimientos funcionales cumple su criterio de aceptación, demostrado sobre el sistema funcionando y no sobre una maqueta.</w:t>
+        <w:t xml:space="preserve">Cada uno de los diecinueve requerimientos funcionales cumple su criterio de aceptación, demostrado sobre el sistema funcionando y no sobre una maqueta.</w:t>
       </w:r>
     </w:p>
     <w:p>
@@ -21345,7 +22341,7 @@
                 <w:sz w:val="19"/>
                 <w:szCs w:val="19"/>
               </w:rPr>
-              <w:t xml:space="preserve">RF-08, RF-09, RF-14</w:t>
+              <w:t xml:space="preserve">RF-08, RF-09, RF-14, RF-18, RF-19</w:t>
             </w:r>
           </w:p>
         </w:tc>
@@ -21739,7 +22735,7 @@
                 <w:sz w:val="19"/>
                 <w:szCs w:val="19"/>
               </w:rPr>
-              <w:t xml:space="preserve">RF-10, RF-11, RF-12, RF-13, RF-14</w:t>
+              <w:t xml:space="preserve">RF-10, RF-11, RF-12, RF-13, RF-14, RF-19</w:t>
             </w:r>
           </w:p>
         </w:tc>
@@ -21835,7 +22831,7 @@
                 <w:sz w:val="19"/>
                 <w:szCs w:val="19"/>
               </w:rPr>
-              <w:t xml:space="preserve">El cobro en línea y el ingreso recurrente por suscripción.</w:t>
+              <w:t xml:space="preserve">El cobro en línea, el ingreso recurrente y el asistente del sitio.</w:t>
             </w:r>
           </w:p>
         </w:tc>
@@ -21865,7 +22861,7 @@
                 <w:sz w:val="19"/>
                 <w:szCs w:val="19"/>
               </w:rPr>
-              <w:t xml:space="preserve">RF-06, RF-07, RF-08, RF-09</w:t>
+              <w:t xml:space="preserve">RF-06, RF-07, RF-08, RF-09, RF-18</w:t>
             </w:r>
           </w:p>
         </w:tc>

</xml_diff>